<commit_message>
docs: saca la mención a personas no técnicas de la descripción
Claude-Session: https://claude.ai/code/session_01Vq3eXx7suutkM6FcFzresT
</commit_message>
<xml_diff>
--- a/backend/docs/descripcion/que-es-bot-core.docx
+++ b/backend/docs/descripcion/que-es-bot-core.docx
@@ -16,19 +16,13 @@
         <w:pStyle w:val="FirstParagraph"/>
       </w:pPr>
       <w:r>
-        <w:t xml:space="preserve">Descripción para personas no técnicas. Explica qué hace esta pieza de</w:t>
-      </w:r>
-      <w:r>
-        <w:t xml:space="preserve"> </w:t>
-      </w:r>
-      <w:r>
-        <w:t xml:space="preserve">software, cómo se usa y qué controles trae, sin entrar en detalles de</w:t>
-      </w:r>
-      <w:r>
-        <w:t xml:space="preserve"> </w:t>
-      </w:r>
-      <w:r>
-        <w:t xml:space="preserve">programación. El detalle técnico está en</w:t>
+        <w:t xml:space="preserve">Qué hace esta pieza de software, cómo se usa y qué controles trae, sin</w:t>
+      </w:r>
+      <w:r>
+        <w:t xml:space="preserve"> </w:t>
+      </w:r>
+      <w:r>
+        <w:t xml:space="preserve">entrar en detalles de programación. El detalle técnico está en</w:t>
       </w:r>
       <w:r>
         <w:t xml:space="preserve"> </w:t>

</xml_diff>

<commit_message>
docs: «ítem» en vez de «caso» en la descripción, y bump a 1.0.1
«Caso» se lee como un término de dominio en más de un rubro (un tratamiento,
un expediente). «Ítem» es neutro y no choca con «registro», que en el
documento ya es lo que quedó anotado. El código sigue usando case_id.

Claude-Session: https://claude.ai/code/session_01Vq3eXx7suutkM6FcFzresT
</commit_message>
<xml_diff>
--- a/backend/docs/descripcion/que-es-bot-core.docx
+++ b/backend/docs/descripcion/que-es-bot-core.docx
@@ -381,7 +381,7 @@
         <w:pStyle w:val="BodyText"/>
       </w:pPr>
       <w:r>
-        <w:t xml:space="preserve">Cada vez que el motor recorre un flujo para un caso (un pedido, una fila de</w:t>
+        <w:t xml:space="preserve">Cada vez que el motor recorre un flujo para un ítem (un pedido, una fila de</w:t>
       </w:r>
       <w:r>
         <w:t xml:space="preserve"> </w:t>
@@ -726,7 +726,7 @@
         <w:t xml:space="preserve"> </w:t>
       </w:r>
       <w:r>
-        <w:t xml:space="preserve">flujo con un caso de ejemplo pero</w:t>
+        <w:t xml:space="preserve">flujo con un ítem de ejemplo pero</w:t>
       </w:r>
       <w:r>
         <w:t xml:space="preserve"> </w:t>
@@ -776,7 +776,7 @@
         <w:t xml:space="preserve"> </w:t>
       </w:r>
       <w:r>
-        <w:t xml:space="preserve">Ahora sí, para un caso real.</w:t>
+        <w:t xml:space="preserve">Ahora sí, para un ítem real.</w:t>
       </w:r>
     </w:p>
     <w:p>
@@ -957,7 +957,7 @@
               <w:jc w:val="left"/>
             </w:pPr>
             <w:r>
-              <w:t xml:space="preserve">líneas de texto por caso, a lo largo de todas sus corridas</w:t>
+              <w:t xml:space="preserve">líneas de texto por ítem, a lo largo de todas sus corridas</w:t>
             </w:r>
           </w:p>
         </w:tc>
@@ -978,7 +978,7 @@
               <w:t xml:space="preserve">“</w:t>
             </w:r>
             <w:r>
-              <w:t xml:space="preserve">¿qué viene pasando con este caso?</w:t>
+              <w:t xml:space="preserve">¿qué viene pasando con este ítem?</w:t>
             </w:r>
             <w:r>
               <w:t xml:space="preserve">”</w:t>
@@ -1176,7 +1176,7 @@
         <w:pStyle w:val="Compact"/>
       </w:pPr>
       <w:r>
-        <w:t xml:space="preserve">Mientras espera, el resto de los casos sigue funcionando.</w:t>
+        <w:t xml:space="preserve">Mientras espera, el resto de los ítems sigue funcionando.</w:t>
       </w:r>
     </w:p>
     <w:p>
@@ -1225,7 +1225,7 @@
         <w:pStyle w:val="Compact"/>
       </w:pPr>
       <w:r>
-        <w:t xml:space="preserve">Si se edita el flujo mientras un caso espera, ese caso sigue con el flujo</w:t>
+        <w:t xml:space="preserve">Si se edita el flujo mientras un ítem espera, ese ítem sigue con el flujo</w:t>
       </w:r>
       <w:r>
         <w:t xml:space="preserve"> </w:t>
@@ -1734,7 +1734,7 @@
       <w:r>
         <w:drawing>
           <wp:inline>
-            <wp:extent cx="4283999" cy="3606349"/>
+            <wp:extent cx="4247999" cy="3595656"/>
             <wp:effectExtent b="0" l="0" r="0" t="0"/>
             <wp:docPr descr="" title="" id="41" name="Picture"/>
             <a:graphic>
@@ -1755,7 +1755,7 @@
                   <pic:spPr bwMode="auto">
                     <a:xfrm>
                       <a:off x="0" y="0"/>
-                      <a:ext cx="4283999" cy="3606349"/>
+                      <a:ext cx="4247999" cy="3595656"/>
                     </a:xfrm>
                     <a:prstGeom prst="rect">
                       <a:avLst/>
@@ -2206,7 +2206,7 @@
         <w:t xml:space="preserve"> </w:t>
       </w:r>
       <w:r>
-        <w:t xml:space="preserve">de pruebas (cientos de casos). Si alguna falla, la versión no se publica.</w:t>
+        <w:t xml:space="preserve">de pruebas (cientos de verificaciones). Si alguna falla, la versión no se publica.</w:t>
       </w:r>
     </w:p>
     <w:p>
@@ -2518,7 +2518,7 @@
         <w:pStyle w:val="Compact"/>
       </w:pPr>
       <w:r>
-        <w:t xml:space="preserve">La conservación del registro (cuánto tiempo, cuántas líneas por caso) es</w:t>
+        <w:t xml:space="preserve">La conservación del registro (cuánto tiempo, cuántas líneas por ítem) es</w:t>
       </w:r>
       <w:r>
         <w:t xml:space="preserve"> </w:t>
@@ -2630,7 +2630,7 @@
               <w:jc w:val="left"/>
             </w:pPr>
             <w:r>
-              <w:t xml:space="preserve">Una vez que el motor recorre un flujo para un caso.</w:t>
+              <w:t xml:space="preserve">Una vez que el motor recorre un flujo para un ítem.</w:t>
             </w:r>
           </w:p>
         </w:tc>
@@ -2644,7 +2644,7 @@
               <w:jc w:val="left"/>
             </w:pPr>
             <w:r>
-              <w:t xml:space="preserve">Caso</w:t>
+              <w:t xml:space="preserve">Ítem</w:t>
             </w:r>
           </w:p>
         </w:tc>
@@ -2812,7 +2812,7 @@
               <w:jc w:val="left"/>
             </w:pPr>
             <w:r>
-              <w:t xml:space="preserve">Las líneas de texto acumuladas sobre un caso.</w:t>
+              <w:t xml:space="preserve">Las líneas de texto acumuladas sobre un ítem.</w:t>
             </w:r>
           </w:p>
         </w:tc>

</xml_diff>